<commit_message>
Add voice dashboard, CRM, inbox, SMS, marketing, digest, token sync fix, linkedin template fix, agent redeploy fix
</commit_message>
<xml_diff>
--- a/Test Admin Rerun Link.docx
+++ b/Test Admin Rerun Link.docx
@@ -3,19 +3,190 @@
 <w:document xmlns:wpc="http://schemas.microsoft.com/office/word/2010/wordprocessingCanvas" xmlns:cx="http://schemas.microsoft.com/office/drawing/2014/chartex" xmlns:cx1="http://schemas.microsoft.com/office/drawing/2015/9/8/chartex" xmlns:cx2="http://schemas.microsoft.com/office/drawing/2015/10/21/chartex" xmlns:cx3="http://schemas.microsoft.com/office/drawing/2016/5/9/chartex" xmlns:cx4="http://schemas.microsoft.com/office/drawing/2016/5/10/chartex" xmlns:cx5="http://schemas.microsoft.com/office/drawing/2016/5/11/chartex" xmlns:cx6="http://schemas.microsoft.com/office/drawing/2016/5/12/chartex" xmlns:cx7="http://schemas.microsoft.com/office/drawing/2016/5/13/chartex" xmlns:cx8="http://schemas.microsoft.com/office/drawing/2016/5/14/chartex" xmlns:mc="http://schemas.openxmlformats.org/markup-compatibility/2006" xmlns:aink="http://schemas.microsoft.com/office/drawing/2016/ink" xmlns:am3d="http://schemas.microsoft.com/office/drawing/2017/model3d" xmlns:o="urn:schemas-microsoft-com:office:office" xmlns:oel="http://schemas.microsoft.com/office/2019/extlst" xmlns:r="http://schemas.openxmlformats.org/officeDocument/2006/relationships" xmlns:m="http://schemas.openxmlformats.org/officeDocument/2006/math" xmlns:v="urn:schemas-microsoft-com:vml" xmlns:wp14="http://schemas.microsoft.com/office/word/2010/wordprocessingDrawing" xmlns:wp="http://schemas.openxmlformats.org/drawingml/2006/wordprocessingDrawing" xmlns:w10="urn:schemas-microsoft-com:office:word" xmlns:w="http://schemas.openxmlformats.org/wordprocessingml/2006/main" xmlns:w14="http://schemas.microsoft.com/office/word/2010/wordml" xmlns:w15="http://schemas.microsoft.com/office/word/2012/wordml" xmlns:w16cex="http://schemas.microsoft.com/office/word/2018/wordml/cex" xmlns:w16cid="http://schemas.microsoft.com/office/word/2016/wordml/cid" xmlns:w16="http://schemas.microsoft.com/office/word/2018/wordml" xmlns:w16du="http://schemas.microsoft.com/office/word/2023/wordml/word16du" xmlns:w16sdtdh="http://schemas.microsoft.com/office/word/2020/wordml/sdtdatahash" xmlns:w16sdtfl="http://schemas.microsoft.com/office/word/2024/wordml/sdtformatlock" xmlns:w16se="http://schemas.microsoft.com/office/word/2015/wordml/symex" xmlns:wpg="http://schemas.microsoft.com/office/word/2010/wordprocessingGroup" xmlns:wpi="http://schemas.microsoft.com/office/word/2010/wordprocessingInk" xmlns:wne="http://schemas.microsoft.com/office/word/2006/wordml" xmlns:wps="http://schemas.microsoft.com/office/word/2010/wordprocessingShape" mc:Ignorable="w14 w15 w16se w16cid w16 w16cex w16sdtdh w16sdtfl w16du wp14">
   <w:body>
     <w:p>
+      <w:pPr>
+        <w:rPr>
+          <w:b/>
+          <w:bCs/>
+          <w:u w:val="single"/>
+        </w:rPr>
+      </w:pPr>
+      <w:r>
+        <w:rPr>
+          <w:b/>
+          <w:bCs/>
+          <w:u w:val="single"/>
+        </w:rPr>
+        <w:t>Business Started Package Rerun</w:t>
+      </w:r>
+    </w:p>
+    <w:p>
+      <w:r>
+        <w:t>https://app.nodusaisystems.com/onboarding/connect?rerun=true&amp;clientId=cmn38f9m20000z1w2l7habr2d</w:t>
+      </w:r>
+    </w:p>
+    <w:p>
+      <w:r>
+        <w:t xml:space="preserve">  NODUS AI SYSTEMS ADMIN PORTAL</w:t>
+      </w:r>
+    </w:p>
+    <w:p>
+      <w:pPr>
+        <w:rPr>
+          <w:b/>
+          <w:bCs/>
+          <w:u w:val="single"/>
+        </w:rPr>
+      </w:pPr>
+      <w:r>
+        <w:rPr>
+          <w:b/>
+          <w:bCs/>
+          <w:u w:val="single"/>
+        </w:rPr>
+        <w:t>Portal Admin Link</w:t>
+      </w:r>
+      <w:r>
+        <w:rPr>
+          <w:b/>
+          <w:bCs/>
+          <w:u w:val="single"/>
+        </w:rPr>
+        <w:t>:</w:t>
+      </w:r>
+    </w:p>
+    <w:p>
+      <w:r>
+        <w:t>Test Client id - cmn38f9m20000z1w2l7habr2d</w:t>
+      </w:r>
+    </w:p>
+    <w:p>
+      <w:pPr>
+        <w:rPr>
+          <w:b/>
+          <w:bCs/>
+          <w:u w:val="single"/>
+        </w:rPr>
+      </w:pPr>
       <w:hyperlink r:id="rId4" w:history="1">
         <w:r>
           <w:rPr>
             <w:rStyle w:val="Hyperlink"/>
+            <w:b/>
+            <w:bCs/>
           </w:rPr>
-          <w:t>https://app.nodusaisystems.com/onboarding/connect?rerun=true&amp;clientId=cmn38f9m20000z1w2l7habr2d</w:t>
+          <w:t>https://app.nodusaisystems.com/admin/configure</w:t>
         </w:r>
       </w:hyperlink>
     </w:p>
+    <w:p>
+      <w:pPr>
+        <w:rPr>
+          <w:b/>
+          <w:bCs/>
+          <w:u w:val="single"/>
+        </w:rPr>
+      </w:pPr>
+      <w:r>
+        <w:t xml:space="preserve">Login : </w:t>
+      </w:r>
+      <w:r>
+        <w:t>lloyd@nodusaisystems.com</w:t>
+      </w:r>
+      <w:r>
+        <w:br/>
+        <w:t>Password: Lloydt10</w:t>
+      </w:r>
+      <w:r>
+        <w:rPr>
+          <w:b/>
+          <w:bCs/>
+          <w:u w:val="single"/>
+        </w:rPr>
+        <w:br/>
+      </w:r>
+      <w:r>
+        <w:rPr>
+          <w:b/>
+          <w:bCs/>
+          <w:u w:val="single"/>
+        </w:rPr>
+        <w:t>Enter the client ID and admin secret</w:t>
+      </w:r>
+    </w:p>
+    <w:p>
+      <w:r>
+        <w:t xml:space="preserve"> (29fb655748eba856841b0bcbf0be9a81e9fcb2c802c42f6c29f2f51758789330), hit Load — you'll see all 9</w:t>
+      </w:r>
+    </w:p>
+    <w:p>
+      <w:r>
+        <w:t xml:space="preserve"> agents with their status. Unconfigured ones expand with a form to fill in the key fields and a  Deploy button.</w:t>
+      </w:r>
+    </w:p>
     <w:p/>
     <w:p>
-      <w:r>
-        <w:t xml:space="preserve">ADMIN Sectre - </w:t>
+      <w:pPr>
+        <w:rPr>
+          <w:b/>
+          <w:bCs/>
+          <w:u w:val="single"/>
+        </w:rPr>
+      </w:pPr>
+      <w:r>
+        <w:rPr>
+          <w:b/>
+          <w:bCs/>
+          <w:u w:val="single"/>
+        </w:rPr>
+        <w:t xml:space="preserve">  For LinkedIn specifically you'll need to fill in:</w:t>
+      </w:r>
+    </w:p>
+    <w:p>
+      <w:r>
+        <w:t xml:space="preserve">  - LinkedIn Search URL — the search results page you want to target</w:t>
+      </w:r>
+    </w:p>
+    <w:p>
+      <w:r>
+        <w:t xml:space="preserve">  - Connection Message Template — with {{</w:t>
+      </w:r>
+      <w:proofErr w:type="spellStart"/>
+      <w:r>
+        <w:t>firstName</w:t>
+      </w:r>
+      <w:proofErr w:type="spellEnd"/>
+      <w:r>
+        <w:t>}} placeholder</w:t>
+      </w:r>
+    </w:p>
+    <w:p>
+      <w:r>
+        <w:t xml:space="preserve">  - Daily Limit — default 20</w:t>
+      </w:r>
+    </w:p>
+    <w:p>
+      <w:r>
+        <w:t xml:space="preserve">  - LinkedIn Session Cookie (</w:t>
+      </w:r>
+      <w:proofErr w:type="spellStart"/>
+      <w:r>
+        <w:t>li_at</w:t>
+      </w:r>
+      <w:proofErr w:type="spellEnd"/>
+      <w:r>
+        <w:t>) — from your browser's LinkedIn session</w:t>
+      </w:r>
+    </w:p>
+    <w:p/>
+    <w:p>
+      <w:r>
+        <w:t>ADMIN Sec</w:t>
+      </w:r>
+      <w:r>
+        <w:t>ret</w:t>
+      </w:r>
+      <w:r>
+        <w:t xml:space="preserve"> - </w:t>
       </w:r>
       <w:r>
         <w:t>c050257773baab9f6bcbc6fe2e7412da509370d1beb4c48956abff9ff3184900</w:t>
@@ -30,6 +201,31 @@
     <w:p>
       <w:r>
         <w:t>agent_d6cafaba111238390ceb0e7064</w:t>
+      </w:r>
+    </w:p>
+    <w:p/>
+    <w:p>
+      <w:r>
+        <w:t>META APP REVIEW</w:t>
+      </w:r>
+    </w:p>
+    <w:p>
+      <w:r>
+        <w:lastRenderedPageBreak/>
+        <w:t xml:space="preserve">Login – </w:t>
+      </w:r>
+      <w:hyperlink r:id="rId5" w:history="1">
+        <w:r>
+          <w:rPr>
+            <w:rStyle w:val="Hyperlink"/>
+          </w:rPr>
+          <w:t>lloyd@nodusaisystems.com</w:t>
+        </w:r>
+      </w:hyperlink>
+    </w:p>
+    <w:p>
+      <w:r>
+        <w:t>Password – Lloydt10</w:t>
       </w:r>
     </w:p>
     <w:sectPr>

</xml_diff>

<commit_message>
Update voice dashboard pages
Co-Authored-By: Claude Opus 4.6 (1M context) <noreply@anthropic.com>
</commit_message>
<xml_diff>
--- a/Test Admin Rerun Link.docx
+++ b/Test Admin Rerun Link.docx
@@ -56,7 +56,10 @@
     </w:p>
     <w:p>
       <w:r>
-        <w:t>Test Client id - cmn38f9m20000z1w2l7habr2d</w:t>
+        <w:t xml:space="preserve">Test Client id - </w:t>
+      </w:r>
+      <w:r>
+        <w:t>cmnb5j2w40000n3norducvi55</w:t>
       </w:r>
     </w:p>
     <w:p>
@@ -1178,6 +1181,18 @@
       <w:shd w:val="clear" w:color="auto" w:fill="E1DFDD"/>
     </w:rPr>
   </w:style>
+  <w:style w:type="character" w:styleId="FollowedHyperlink">
+    <w:name w:val="FollowedHyperlink"/>
+    <w:basedOn w:val="DefaultParagraphFont"/>
+    <w:uiPriority w:val="99"/>
+    <w:semiHidden/>
+    <w:unhideWhenUsed/>
+    <w:rsid w:val="00367EEC"/>
+    <w:rPr>
+      <w:color w:val="96607D" w:themeColor="followedHyperlink"/>
+      <w:u w:val="single"/>
+    </w:rPr>
+  </w:style>
 </w:styles>
 </file>
 

</xml_diff>